<commit_message>
Template: rule below the title block, Jakarta headings, version number out, five spacing fixes, brand PDF built
</commit_message>
<xml_diff>
--- a/public/AI-Use-Policy-Template.docx
+++ b/public/AI-Use-Policy-Template.docx
@@ -4,15 +4,75 @@
   <w:body>
     <w:p>
       <w:pPr>
-        <w:spacing w:after="0" w:before="1600"/>
-      </w:pPr>
+        <w:spacing w:after="0" w:before="1920"/>
+      </w:pPr>
+    </w:p>
+    <w:p>
+      <w:pPr>
+        <w:spacing w:after="280" w:before="160"/>
+      </w:pPr>
+      <w:r>
+        <w:rPr>
+          <w:rFonts w:ascii="Calibri" w:cs="Calibri" w:eastAsia="Calibri" w:hAnsi="Calibri"/>
+          <w:b/>
+          <w:bCs/>
+          <w:color w:val="2D35C9"/>
+          <w:sz w:val="76"/>
+          <w:szCs w:val="76"/>
+        </w:rPr>
+        <w:t xml:space="preserve">AI Use Policy</w:t>
+      </w:r>
+    </w:p>
+    <w:p>
+      <w:pPr>
+        <w:spacing w:after="220"/>
+      </w:pPr>
+      <w:r>
+        <w:rPr>
+          <w:rFonts w:ascii="Calibri" w:cs="Calibri" w:eastAsia="Calibri" w:hAnsi="Calibri"/>
+          <w:color w:val="1A1510"/>
+          <w:sz w:val="26"/>
+          <w:szCs w:val="26"/>
+        </w:rPr>
+        <w:t xml:space="preserve">A template for charity, cultural and heritage organisations</w:t>
+      </w:r>
+    </w:p>
+    <w:p>
+      <w:pPr>
+        <w:spacing w:after="400"/>
+      </w:pPr>
+      <w:r>
+        <w:rPr>
+          <w:rFonts w:ascii="Calibri" w:cs="Calibri" w:eastAsia="Calibri" w:hAnsi="Calibri"/>
+          <w:i/>
+          <w:iCs/>
+          <w:color w:val="9A8F82"/>
+          <w:sz w:val="21"/>
+          <w:szCs w:val="21"/>
+        </w:rPr>
+        <w:t xml:space="preserve">Free to use, free to adapt, and written to be argued with.</w:t>
+      </w:r>
+    </w:p>
+    <w:p>
+      <w:pPr>
+        <w:spacing w:after="320"/>
+      </w:pPr>
+      <w:r>
+        <w:rPr>
+          <w:rFonts w:ascii="Calibri" w:cs="Calibri" w:eastAsia="Calibri" w:hAnsi="Calibri"/>
+          <w:color w:val="2D35C9"/>
+          <w:sz w:val="19"/>
+          <w:szCs w:val="19"/>
+        </w:rPr>
+        <w:t>Last checked against UK law and ICO guidance on 25 August 2026</w:t>
+      </w:r>
     </w:p>
     <w:p>
       <w:pPr>
         <w:pBdr>
           <w:bottom w:val="single" w:color="C8F04A" w:sz="24"/>
         </w:pBdr>
-        <w:spacing w:after="0"/>
+        <w:spacing w:after="2600"/>
       </w:pPr>
       <w:r>
         <w:rPr>
@@ -24,67 +84,7 @@
     </w:p>
     <w:p>
       <w:pPr>
-        <w:spacing w:after="80" w:before="420"/>
-      </w:pPr>
-      <w:r>
-        <w:rPr>
-          <w:rFonts w:ascii="Calibri" w:cs="Calibri" w:eastAsia="Calibri" w:hAnsi="Calibri"/>
-          <w:b/>
-          <w:bCs/>
-          <w:color w:val="2D35C9"/>
-          <w:sz w:val="76"/>
-          <w:szCs w:val="76"/>
-        </w:rPr>
-        <w:t xml:space="preserve">AI Use Policy</w:t>
-      </w:r>
-    </w:p>
-    <w:p>
-      <w:pPr>
-        <w:spacing w:after="60"/>
-      </w:pPr>
-      <w:r>
-        <w:rPr>
-          <w:rFonts w:ascii="Calibri" w:cs="Calibri" w:eastAsia="Calibri" w:hAnsi="Calibri"/>
-          <w:color w:val="1A1510"/>
-          <w:sz w:val="26"/>
-          <w:szCs w:val="26"/>
-        </w:rPr>
-        <w:t xml:space="preserve">A template for charity, cultural and heritage organisations</w:t>
-      </w:r>
-    </w:p>
-    <w:p>
-      <w:pPr>
-        <w:spacing w:after="200"/>
-      </w:pPr>
-      <w:r>
-        <w:rPr>
-          <w:rFonts w:ascii="Calibri" w:cs="Calibri" w:eastAsia="Calibri" w:hAnsi="Calibri"/>
-          <w:i/>
-          <w:iCs/>
-          <w:color w:val="9A8F82"/>
-          <w:sz w:val="21"/>
-          <w:szCs w:val="21"/>
-        </w:rPr>
-        <w:t xml:space="preserve">Free to use, free to adapt, and written to be argued with.</w:t>
-      </w:r>
-    </w:p>
-    <w:p>
-      <w:pPr>
-        <w:spacing w:after="3000"/>
-      </w:pPr>
-      <w:r>
-        <w:rPr>
-          <w:rFonts w:ascii="Calibri" w:cs="Calibri" w:eastAsia="Calibri" w:hAnsi="Calibri"/>
-          <w:color w:val="2D35C9"/>
-          <w:sz w:val="19"/>
-          <w:szCs w:val="19"/>
-        </w:rPr>
-        <w:t xml:space="preserve">Template v1.0  ·  Last checked against UK law and ICO guidance on 25 August 2026</w:t>
-      </w:r>
-    </w:p>
-    <w:p>
-      <w:pPr>
-        <w:spacing w:after="20"/>
+        <w:spacing w:after="80"/>
       </w:pPr>
       <w:r>
         <w:rPr>
@@ -100,7 +100,7 @@
     </w:p>
     <w:p>
       <w:pPr>
-        <w:spacing w:after="20"/>
+        <w:spacing w:after="100"/>
       </w:pPr>
       <w:r>
         <w:rPr>
@@ -280,7 +280,7 @@
           <w:ilvl w:val="0"/>
           <w:numId w:val="2"/>
         </w:numPr>
-        <w:spacing w:after="90" w:line="320"/>
+        <w:spacing w:after="140" w:line="320"/>
       </w:pPr>
       <w:r>
         <w:rPr>
@@ -474,20 +474,13 @@
     </w:p>
     <w:p>
       <w:pPr>
+        <w:pStyle w:val="ListParagraph"/>
+        <w:numPr>
+          <w:ilvl w:val="0"/>
+          <w:numId w:val="4"/>
+        </w:numPr>
         <w:spacing w:after="90" w:line="320"/>
-        <w:ind w:left="400" w:hanging="400"/>
-      </w:pPr>
-      <w:r>
-        <w:rPr>
-          <w:rFonts w:ascii="Calibri" w:cs="Calibri" w:eastAsia="Calibri" w:hAnsi="Calibri"/>
-          <w:b/>
-          <w:bCs/>
-          <w:color w:val="2D35C9"/>
-          <w:sz w:val="21"/>
-          <w:szCs w:val="21"/>
-        </w:rPr>
-        <w:t xml:space="preserve">1.  </w:t>
-      </w:r>
+      </w:pPr>
       <w:r>
         <w:rPr>
           <w:rFonts w:ascii="Calibri" w:cs="Calibri" w:eastAsia="Calibri" w:hAnsi="Calibri"/>
@@ -511,20 +504,13 @@
     </w:p>
     <w:p>
       <w:pPr>
+        <w:pStyle w:val="ListParagraph"/>
+        <w:numPr>
+          <w:ilvl w:val="0"/>
+          <w:numId w:val="4"/>
+        </w:numPr>
         <w:spacing w:after="90" w:line="320"/>
-        <w:ind w:left="400" w:hanging="400"/>
-      </w:pPr>
-      <w:r>
-        <w:rPr>
-          <w:rFonts w:ascii="Calibri" w:cs="Calibri" w:eastAsia="Calibri" w:hAnsi="Calibri"/>
-          <w:b/>
-          <w:bCs/>
-          <w:color w:val="2D35C9"/>
-          <w:sz w:val="21"/>
-          <w:szCs w:val="21"/>
-        </w:rPr>
-        <w:t xml:space="preserve">2.  </w:t>
-      </w:r>
+      </w:pPr>
       <w:r>
         <w:rPr>
           <w:rFonts w:ascii="Calibri" w:cs="Calibri" w:eastAsia="Calibri" w:hAnsi="Calibri"/>
@@ -548,20 +534,13 @@
     </w:p>
     <w:p>
       <w:pPr>
+        <w:pStyle w:val="ListParagraph"/>
+        <w:numPr>
+          <w:ilvl w:val="0"/>
+          <w:numId w:val="4"/>
+        </w:numPr>
         <w:spacing w:after="90" w:line="320"/>
-        <w:ind w:left="400" w:hanging="400"/>
-      </w:pPr>
-      <w:r>
-        <w:rPr>
-          <w:rFonts w:ascii="Calibri" w:cs="Calibri" w:eastAsia="Calibri" w:hAnsi="Calibri"/>
-          <w:b/>
-          <w:bCs/>
-          <w:color w:val="2D35C9"/>
-          <w:sz w:val="21"/>
-          <w:szCs w:val="21"/>
-        </w:rPr>
-        <w:t xml:space="preserve">3.  </w:t>
-      </w:r>
+      </w:pPr>
       <w:r>
         <w:rPr>
           <w:rFonts w:ascii="Calibri" w:cs="Calibri" w:eastAsia="Calibri" w:hAnsi="Calibri"/>
@@ -585,20 +564,13 @@
     </w:p>
     <w:p>
       <w:pPr>
+        <w:pStyle w:val="ListParagraph"/>
+        <w:numPr>
+          <w:ilvl w:val="0"/>
+          <w:numId w:val="4"/>
+        </w:numPr>
         <w:spacing w:after="90" w:line="320"/>
-        <w:ind w:left="400" w:hanging="400"/>
-      </w:pPr>
-      <w:r>
-        <w:rPr>
-          <w:rFonts w:ascii="Calibri" w:cs="Calibri" w:eastAsia="Calibri" w:hAnsi="Calibri"/>
-          <w:b/>
-          <w:bCs/>
-          <w:color w:val="2D35C9"/>
-          <w:sz w:val="21"/>
-          <w:szCs w:val="21"/>
-        </w:rPr>
-        <w:t xml:space="preserve">4.  </w:t>
-      </w:r>
+      </w:pPr>
       <w:r>
         <w:rPr>
           <w:rFonts w:ascii="Calibri" w:cs="Calibri" w:eastAsia="Calibri" w:hAnsi="Calibri"/>
@@ -622,20 +594,13 @@
     </w:p>
     <w:p>
       <w:pPr>
-        <w:spacing w:after="90" w:line="320"/>
-        <w:ind w:left="400" w:hanging="400"/>
-      </w:pPr>
-      <w:r>
-        <w:rPr>
-          <w:rFonts w:ascii="Calibri" w:cs="Calibri" w:eastAsia="Calibri" w:hAnsi="Calibri"/>
-          <w:b/>
-          <w:bCs/>
-          <w:color w:val="2D35C9"/>
-          <w:sz w:val="21"/>
-          <w:szCs w:val="21"/>
-        </w:rPr>
-        <w:t xml:space="preserve">5.  </w:t>
-      </w:r>
+        <w:pStyle w:val="ListParagraph"/>
+        <w:numPr>
+          <w:ilvl w:val="0"/>
+          <w:numId w:val="4"/>
+        </w:numPr>
+        <w:spacing w:after="140" w:line="320"/>
+      </w:pPr>
       <w:r>
         <w:rPr>
           <w:rFonts w:ascii="Calibri" w:cs="Calibri" w:eastAsia="Calibri" w:hAnsi="Calibri"/>
@@ -928,7 +893,7 @@
           <w:ilvl w:val="0"/>
           <w:numId w:val="2"/>
         </w:numPr>
-        <w:spacing w:after="90" w:line="320"/>
+        <w:spacing w:after="140" w:line="320"/>
       </w:pPr>
       <w:r>
         <w:rPr>
@@ -1037,7 +1002,7 @@
     </w:p>
     <w:p>
       <w:pPr>
-        <w:spacing w:after="140" w:line="320"/>
+        <w:spacing w:after="360" w:line="320" w:before="240"/>
       </w:pPr>
       <w:r>
         <w:rPr>
@@ -1399,12 +1364,7 @@
     </w:tbl>
     <w:p>
       <w:pPr>
-        <w:spacing w:after="200"/>
-      </w:pPr>
-    </w:p>
-    <w:p>
-      <w:pPr>
-        <w:spacing w:after="140" w:line="320"/>
+        <w:spacing w:after="140" w:line="320" w:before="360"/>
       </w:pPr>
       <w:r>
         <w:rPr>
@@ -1429,20 +1389,13 @@
     </w:p>
     <w:p>
       <w:pPr>
+        <w:pStyle w:val="ListParagraph"/>
+        <w:numPr>
+          <w:ilvl w:val="0"/>
+          <w:numId w:val="5"/>
+        </w:numPr>
         <w:spacing w:after="90" w:line="320"/>
-        <w:ind w:left="400" w:hanging="400"/>
-      </w:pPr>
-      <w:r>
-        <w:rPr>
-          <w:rFonts w:ascii="Calibri" w:cs="Calibri" w:eastAsia="Calibri" w:hAnsi="Calibri"/>
-          <w:b/>
-          <w:bCs/>
-          <w:color w:val="2D35C9"/>
-          <w:sz w:val="21"/>
-          <w:szCs w:val="21"/>
-        </w:rPr>
-        <w:t xml:space="preserve">1.  </w:t>
-      </w:r>
+      </w:pPr>
       <w:r>
         <w:rPr>
           <w:rFonts w:ascii="Calibri" w:cs="Calibri" w:eastAsia="Calibri" w:hAnsi="Calibri"/>
@@ -1466,20 +1419,13 @@
     </w:p>
     <w:p>
       <w:pPr>
+        <w:pStyle w:val="ListParagraph"/>
+        <w:numPr>
+          <w:ilvl w:val="0"/>
+          <w:numId w:val="5"/>
+        </w:numPr>
         <w:spacing w:after="90" w:line="320"/>
-        <w:ind w:left="400" w:hanging="400"/>
-      </w:pPr>
-      <w:r>
-        <w:rPr>
-          <w:rFonts w:ascii="Calibri" w:cs="Calibri" w:eastAsia="Calibri" w:hAnsi="Calibri"/>
-          <w:b/>
-          <w:bCs/>
-          <w:color w:val="2D35C9"/>
-          <w:sz w:val="21"/>
-          <w:szCs w:val="21"/>
-        </w:rPr>
-        <w:t xml:space="preserve">2.  </w:t>
-      </w:r>
+      </w:pPr>
       <w:r>
         <w:rPr>
           <w:rFonts w:ascii="Calibri" w:cs="Calibri" w:eastAsia="Calibri" w:hAnsi="Calibri"/>
@@ -1503,20 +1449,13 @@
     </w:p>
     <w:p>
       <w:pPr>
+        <w:pStyle w:val="ListParagraph"/>
+        <w:numPr>
+          <w:ilvl w:val="0"/>
+          <w:numId w:val="5"/>
+        </w:numPr>
         <w:spacing w:after="90" w:line="320"/>
-        <w:ind w:left="400" w:hanging="400"/>
-      </w:pPr>
-      <w:r>
-        <w:rPr>
-          <w:rFonts w:ascii="Calibri" w:cs="Calibri" w:eastAsia="Calibri" w:hAnsi="Calibri"/>
-          <w:b/>
-          <w:bCs/>
-          <w:color w:val="2D35C9"/>
-          <w:sz w:val="21"/>
-          <w:szCs w:val="21"/>
-        </w:rPr>
-        <w:t xml:space="preserve">3.  </w:t>
-      </w:r>
+      </w:pPr>
       <w:r>
         <w:rPr>
           <w:rFonts w:ascii="Calibri" w:cs="Calibri" w:eastAsia="Calibri" w:hAnsi="Calibri"/>
@@ -1540,97 +1479,109 @@
     </w:p>
     <w:p>
       <w:pPr>
+        <w:pStyle w:val="ListParagraph"/>
+        <w:numPr>
+          <w:ilvl w:val="0"/>
+          <w:numId w:val="5"/>
+        </w:numPr>
+        <w:spacing w:after="140" w:line="320"/>
+      </w:pPr>
+      <w:r>
+        <w:rPr>
+          <w:rFonts w:ascii="Calibri" w:cs="Calibri" w:eastAsia="Calibri" w:hAnsi="Calibri"/>
+          <w:b/>
+          <w:bCs/>
+          <w:color w:val="1A1510"/>
+          <w:sz w:val="21"/>
+          <w:szCs w:val="21"/>
+        </w:rPr>
+        <w:t xml:space="preserve">No AI tool at all.</w:t>
+      </w:r>
+      <w:r>
+        <w:rPr>
+          <w:rFonts w:ascii="Calibri" w:cs="Calibri" w:eastAsia="Calibri" w:hAnsi="Calibri"/>
+          <w:color w:val="1A1510"/>
+          <w:sz w:val="21"/>
+          <w:szCs w:val="21"/>
+        </w:rPr>
+        <w:t xml:space="preserve"> The correct answer for some categories. See section 7.</w:t>
+      </w:r>
+    </w:p>
+    <w:p>
+      <w:pPr>
+        <w:spacing w:after="140" w:line="320"/>
+      </w:pPr>
+      <w:r>
+        <w:rPr>
+          <w:rFonts w:ascii="Calibri" w:cs="Calibri" w:eastAsia="Calibri" w:hAnsi="Calibri"/>
+          <w:color w:val="1A1510"/>
+          <w:sz w:val="21"/>
+          <w:szCs w:val="21"/>
+        </w:rPr>
+        <w:t xml:space="preserve">If you do not know which position a tool sits in, it is not approved yet.</w:t>
+      </w:r>
+    </w:p>
+    <w:p>
+      <w:pPr>
+        <w:spacing w:after="140" w:line="320" w:before="240"/>
+      </w:pPr>
+      <w:r>
+        <w:rPr>
+          <w:rFonts w:ascii="Calibri" w:cs="Calibri" w:eastAsia="Calibri" w:hAnsi="Calibri"/>
+          <w:b/>
+          <w:bCs/>
+          <w:color w:val="1A1510"/>
+          <w:sz w:val="21"/>
+          <w:szCs w:val="21"/>
+        </w:rPr>
+        <w:t xml:space="preserve">What happens to what we put in</w:t>
+      </w:r>
+    </w:p>
+    <w:p>
+      <w:pPr>
+        <w:spacing w:after="140" w:line="320"/>
+      </w:pPr>
+      <w:r>
+        <w:rPr>
+          <w:rFonts w:ascii="Calibri" w:cs="Calibri" w:eastAsia="Calibri" w:hAnsi="Calibri"/>
+          <w:color w:val="1A1510"/>
+          <w:sz w:val="21"/>
+          <w:szCs w:val="21"/>
+        </w:rPr>
+        <w:t xml:space="preserve">A chat history is a record. Where it contains personal data, UK GDPR applies to it exactly as it applies to anything else we hold, including a subject access request.</w:t>
+      </w:r>
+    </w:p>
+    <w:p>
+      <w:pPr>
+        <w:spacing w:after="140" w:line="320"/>
+      </w:pPr>
+      <w:r>
+        <w:rPr>
+          <w:rFonts w:ascii="Calibri" w:cs="Calibri" w:eastAsia="Calibri" w:hAnsi="Calibri"/>
+          <w:color w:val="1A1510"/>
+          <w:sz w:val="21"/>
+          <w:szCs w:val="21"/>
+        </w:rPr>
+        <w:t xml:space="preserve">Most tools keep conversations indefinitely unless told otherwise. For every tool in the register, [NAME / ROLE] records where history is stored, what retention the tool lets us set, and who can delete it.</w:t>
+      </w:r>
+    </w:p>
+    <w:p>
+      <w:pPr>
+        <w:pStyle w:val="ListParagraph"/>
+        <w:numPr>
+          <w:ilvl w:val="0"/>
+          <w:numId w:val="2"/>
+        </w:numPr>
         <w:spacing w:after="90" w:line="320"/>
-        <w:ind w:left="400" w:hanging="400"/>
-      </w:pPr>
-      <w:r>
-        <w:rPr>
-          <w:rFonts w:ascii="Calibri" w:cs="Calibri" w:eastAsia="Calibri" w:hAnsi="Calibri"/>
-          <w:b/>
-          <w:bCs/>
-          <w:color w:val="2D35C9"/>
-          <w:sz w:val="21"/>
-          <w:szCs w:val="21"/>
-        </w:rPr>
-        <w:t xml:space="preserve">4.  </w:t>
-      </w:r>
-      <w:r>
-        <w:rPr>
-          <w:rFonts w:ascii="Calibri" w:cs="Calibri" w:eastAsia="Calibri" w:hAnsi="Calibri"/>
-          <w:b/>
-          <w:bCs/>
-          <w:color w:val="1A1510"/>
-          <w:sz w:val="21"/>
-          <w:szCs w:val="21"/>
-        </w:rPr>
-        <w:t xml:space="preserve">No AI tool at all.</w:t>
-      </w:r>
-      <w:r>
-        <w:rPr>
-          <w:rFonts w:ascii="Calibri" w:cs="Calibri" w:eastAsia="Calibri" w:hAnsi="Calibri"/>
-          <w:color w:val="1A1510"/>
-          <w:sz w:val="21"/>
-          <w:szCs w:val="21"/>
-        </w:rPr>
-        <w:t xml:space="preserve"> The correct answer for some categories. See section 7.</w:t>
-      </w:r>
-    </w:p>
-    <w:p>
-      <w:pPr>
-        <w:spacing w:after="140" w:line="320"/>
-      </w:pPr>
-      <w:r>
-        <w:rPr>
-          <w:rFonts w:ascii="Calibri" w:cs="Calibri" w:eastAsia="Calibri" w:hAnsi="Calibri"/>
-          <w:color w:val="1A1510"/>
-          <w:sz w:val="21"/>
-          <w:szCs w:val="21"/>
-        </w:rPr>
-        <w:t xml:space="preserve">If you do not know which position a tool sits in, it is not approved yet.</w:t>
-      </w:r>
-    </w:p>
-    <w:p>
-      <w:pPr>
-        <w:spacing w:after="140" w:line="320"/>
-      </w:pPr>
-      <w:r>
-        <w:rPr>
-          <w:rFonts w:ascii="Calibri" w:cs="Calibri" w:eastAsia="Calibri" w:hAnsi="Calibri"/>
-          <w:b/>
-          <w:bCs/>
-          <w:color w:val="1A1510"/>
-          <w:sz w:val="21"/>
-          <w:szCs w:val="21"/>
-        </w:rPr>
-        <w:t xml:space="preserve">What happens to what we put in</w:t>
-      </w:r>
-    </w:p>
-    <w:p>
-      <w:pPr>
-        <w:spacing w:after="140" w:line="320"/>
-      </w:pPr>
-      <w:r>
-        <w:rPr>
-          <w:rFonts w:ascii="Calibri" w:cs="Calibri" w:eastAsia="Calibri" w:hAnsi="Calibri"/>
-          <w:color w:val="1A1510"/>
-          <w:sz w:val="21"/>
-          <w:szCs w:val="21"/>
-        </w:rPr>
-        <w:t xml:space="preserve">A chat history is a record. Where it contains personal data, UK GDPR applies to it exactly as it applies to anything else we hold, including a subject access request.</w:t>
-      </w:r>
-    </w:p>
-    <w:p>
-      <w:pPr>
-        <w:spacing w:after="140" w:line="320"/>
-      </w:pPr>
-      <w:r>
-        <w:rPr>
-          <w:rFonts w:ascii="Calibri" w:cs="Calibri" w:eastAsia="Calibri" w:hAnsi="Calibri"/>
-          <w:color w:val="1A1510"/>
-          <w:sz w:val="21"/>
-          <w:szCs w:val="21"/>
-        </w:rPr>
-        <w:t xml:space="preserve">Most tools keep conversations indefinitely unless told otherwise. For every tool in the register, [NAME / ROLE] records where history is stored, what retention the tool lets us set, and who can delete it.</w:t>
+      </w:pPr>
+      <w:r>
+        <w:rPr>
+          <w:rFonts w:ascii="Calibri" w:cs="Calibri" w:eastAsia="Calibri" w:hAnsi="Calibri"/>
+          <w:color w:val="1A1510"/>
+          <w:sz w:val="21"/>
+          <w:szCs w:val="21"/>
+        </w:rPr>
+        <w:t xml:space="preserve">Set retention where the tool allows it. Where it does not, that counts against the tool at the gate.</w:t>
       </w:r>
     </w:p>
     <w:p>
@@ -1649,7 +1600,7 @@
           <w:sz w:val="21"/>
           <w:szCs w:val="21"/>
         </w:rPr>
-        <w:t xml:space="preserve">Set retention where the tool allows it. Where it does not, that counts against the tool at the gate.</w:t>
+        <w:t xml:space="preserve">Delete a conversation when the work it supported is finished, unless there is a reason to keep it. Write the reason down.</w:t>
       </w:r>
     </w:p>
     <w:p>
@@ -1659,26 +1610,7 @@
           <w:ilvl w:val="0"/>
           <w:numId w:val="2"/>
         </w:numPr>
-        <w:spacing w:after="90" w:line="320"/>
-      </w:pPr>
-      <w:r>
-        <w:rPr>
-          <w:rFonts w:ascii="Calibri" w:cs="Calibri" w:eastAsia="Calibri" w:hAnsi="Calibri"/>
-          <w:color w:val="1A1510"/>
-          <w:sz w:val="21"/>
-          <w:szCs w:val="21"/>
-        </w:rPr>
-        <w:t xml:space="preserve">Delete a conversation when the work it supported is finished, unless there is a reason to keep it. Write the reason down.</w:t>
-      </w:r>
-    </w:p>
-    <w:p>
-      <w:pPr>
-        <w:pStyle w:val="ListParagraph"/>
-        <w:numPr>
-          <w:ilvl w:val="0"/>
-          <w:numId w:val="2"/>
-        </w:numPr>
-        <w:spacing w:after="90" w:line="320"/>
+        <w:spacing w:after="140" w:line="320"/>
       </w:pPr>
       <w:r>
         <w:rPr>
@@ -1946,7 +1878,7 @@
           <w:ilvl w:val="0"/>
           <w:numId w:val="2"/>
         </w:numPr>
-        <w:spacing w:after="90" w:line="320"/>
+        <w:spacing w:after="140" w:line="320"/>
       </w:pPr>
       <w:r>
         <w:rPr>
@@ -2005,20 +1937,13 @@
     </w:p>
     <w:p>
       <w:pPr>
+        <w:pStyle w:val="ListParagraph"/>
+        <w:numPr>
+          <w:ilvl w:val="0"/>
+          <w:numId w:val="6"/>
+        </w:numPr>
         <w:spacing w:after="90" w:line="320"/>
-        <w:ind w:left="400" w:hanging="400"/>
-      </w:pPr>
-      <w:r>
-        <w:rPr>
-          <w:rFonts w:ascii="Calibri" w:cs="Calibri" w:eastAsia="Calibri" w:hAnsi="Calibri"/>
-          <w:b/>
-          <w:bCs/>
-          <w:color w:val="2D35C9"/>
-          <w:sz w:val="21"/>
-          <w:szCs w:val="21"/>
-        </w:rPr>
-        <w:t xml:space="preserve">1.  </w:t>
-      </w:r>
+      </w:pPr>
       <w:r>
         <w:rPr>
           <w:rFonts w:ascii="Calibri" w:cs="Calibri" w:eastAsia="Calibri" w:hAnsi="Calibri"/>
@@ -2042,20 +1967,13 @@
     </w:p>
     <w:p>
       <w:pPr>
+        <w:pStyle w:val="ListParagraph"/>
+        <w:numPr>
+          <w:ilvl w:val="0"/>
+          <w:numId w:val="6"/>
+        </w:numPr>
         <w:spacing w:after="90" w:line="320"/>
-        <w:ind w:left="400" w:hanging="400"/>
-      </w:pPr>
-      <w:r>
-        <w:rPr>
-          <w:rFonts w:ascii="Calibri" w:cs="Calibri" w:eastAsia="Calibri" w:hAnsi="Calibri"/>
-          <w:b/>
-          <w:bCs/>
-          <w:color w:val="2D35C9"/>
-          <w:sz w:val="21"/>
-          <w:szCs w:val="21"/>
-        </w:rPr>
-        <w:t xml:space="preserve">2.  </w:t>
-      </w:r>
+      </w:pPr>
       <w:r>
         <w:rPr>
           <w:rFonts w:ascii="Calibri" w:cs="Calibri" w:eastAsia="Calibri" w:hAnsi="Calibri"/>
@@ -2070,20 +1988,13 @@
     </w:p>
     <w:p>
       <w:pPr>
+        <w:pStyle w:val="ListParagraph"/>
+        <w:numPr>
+          <w:ilvl w:val="0"/>
+          <w:numId w:val="6"/>
+        </w:numPr>
         <w:spacing w:after="90" w:line="320"/>
-        <w:ind w:left="400" w:hanging="400"/>
-      </w:pPr>
-      <w:r>
-        <w:rPr>
-          <w:rFonts w:ascii="Calibri" w:cs="Calibri" w:eastAsia="Calibri" w:hAnsi="Calibri"/>
-          <w:b/>
-          <w:bCs/>
-          <w:color w:val="2D35C9"/>
-          <w:sz w:val="21"/>
-          <w:szCs w:val="21"/>
-        </w:rPr>
-        <w:t xml:space="preserve">3.  </w:t>
-      </w:r>
+      </w:pPr>
       <w:r>
         <w:rPr>
           <w:rFonts w:ascii="Calibri" w:cs="Calibri" w:eastAsia="Calibri" w:hAnsi="Calibri"/>
@@ -2107,20 +2018,13 @@
     </w:p>
     <w:p>
       <w:pPr>
+        <w:pStyle w:val="ListParagraph"/>
+        <w:numPr>
+          <w:ilvl w:val="0"/>
+          <w:numId w:val="6"/>
+        </w:numPr>
         <w:spacing w:after="90" w:line="320"/>
-        <w:ind w:left="400" w:hanging="400"/>
-      </w:pPr>
-      <w:r>
-        <w:rPr>
-          <w:rFonts w:ascii="Calibri" w:cs="Calibri" w:eastAsia="Calibri" w:hAnsi="Calibri"/>
-          <w:b/>
-          <w:bCs/>
-          <w:color w:val="2D35C9"/>
-          <w:sz w:val="21"/>
-          <w:szCs w:val="21"/>
-        </w:rPr>
-        <w:t xml:space="preserve">4.  </w:t>
-      </w:r>
+      </w:pPr>
       <w:r>
         <w:rPr>
           <w:rFonts w:ascii="Calibri" w:cs="Calibri" w:eastAsia="Calibri" w:hAnsi="Calibri"/>
@@ -2144,20 +2048,13 @@
     </w:p>
     <w:p>
       <w:pPr>
+        <w:pStyle w:val="ListParagraph"/>
+        <w:numPr>
+          <w:ilvl w:val="0"/>
+          <w:numId w:val="6"/>
+        </w:numPr>
         <w:spacing w:after="90" w:line="320"/>
-        <w:ind w:left="400" w:hanging="400"/>
-      </w:pPr>
-      <w:r>
-        <w:rPr>
-          <w:rFonts w:ascii="Calibri" w:cs="Calibri" w:eastAsia="Calibri" w:hAnsi="Calibri"/>
-          <w:b/>
-          <w:bCs/>
-          <w:color w:val="2D35C9"/>
-          <w:sz w:val="21"/>
-          <w:szCs w:val="21"/>
-        </w:rPr>
-        <w:t xml:space="preserve">5.  </w:t>
-      </w:r>
+      </w:pPr>
       <w:r>
         <w:rPr>
           <w:rFonts w:ascii="Calibri" w:cs="Calibri" w:eastAsia="Calibri" w:hAnsi="Calibri"/>
@@ -2181,20 +2078,13 @@
     </w:p>
     <w:p>
       <w:pPr>
+        <w:pStyle w:val="ListParagraph"/>
+        <w:numPr>
+          <w:ilvl w:val="0"/>
+          <w:numId w:val="6"/>
+        </w:numPr>
         <w:spacing w:after="90" w:line="320"/>
-        <w:ind w:left="400" w:hanging="400"/>
-      </w:pPr>
-      <w:r>
-        <w:rPr>
-          <w:rFonts w:ascii="Calibri" w:cs="Calibri" w:eastAsia="Calibri" w:hAnsi="Calibri"/>
-          <w:b/>
-          <w:bCs/>
-          <w:color w:val="2D35C9"/>
-          <w:sz w:val="21"/>
-          <w:szCs w:val="21"/>
-        </w:rPr>
-        <w:t xml:space="preserve">6.  </w:t>
-      </w:r>
+      </w:pPr>
       <w:r>
         <w:rPr>
           <w:rFonts w:ascii="Calibri" w:cs="Calibri" w:eastAsia="Calibri" w:hAnsi="Calibri"/>
@@ -2218,20 +2108,13 @@
     </w:p>
     <w:p>
       <w:pPr>
+        <w:pStyle w:val="ListParagraph"/>
+        <w:numPr>
+          <w:ilvl w:val="0"/>
+          <w:numId w:val="6"/>
+        </w:numPr>
         <w:spacing w:after="90" w:line="320"/>
-        <w:ind w:left="400" w:hanging="400"/>
-      </w:pPr>
-      <w:r>
-        <w:rPr>
-          <w:rFonts w:ascii="Calibri" w:cs="Calibri" w:eastAsia="Calibri" w:hAnsi="Calibri"/>
-          <w:b/>
-          <w:bCs/>
-          <w:color w:val="2D35C9"/>
-          <w:sz w:val="21"/>
-          <w:szCs w:val="21"/>
-        </w:rPr>
-        <w:t xml:space="preserve">7.  </w:t>
-      </w:r>
+      </w:pPr>
       <w:r>
         <w:rPr>
           <w:rFonts w:ascii="Calibri" w:cs="Calibri" w:eastAsia="Calibri" w:hAnsi="Calibri"/>
@@ -2255,20 +2138,13 @@
     </w:p>
     <w:p>
       <w:pPr>
+        <w:pStyle w:val="ListParagraph"/>
+        <w:numPr>
+          <w:ilvl w:val="0"/>
+          <w:numId w:val="6"/>
+        </w:numPr>
         <w:spacing w:after="90" w:line="320"/>
-        <w:ind w:left="400" w:hanging="400"/>
-      </w:pPr>
-      <w:r>
-        <w:rPr>
-          <w:rFonts w:ascii="Calibri" w:cs="Calibri" w:eastAsia="Calibri" w:hAnsi="Calibri"/>
-          <w:b/>
-          <w:bCs/>
-          <w:color w:val="2D35C9"/>
-          <w:sz w:val="21"/>
-          <w:szCs w:val="21"/>
-        </w:rPr>
-        <w:t xml:space="preserve">8.  </w:t>
-      </w:r>
+      </w:pPr>
       <w:r>
         <w:rPr>
           <w:rFonts w:ascii="Calibri" w:cs="Calibri" w:eastAsia="Calibri" w:hAnsi="Calibri"/>
@@ -2292,20 +2168,13 @@
     </w:p>
     <w:p>
       <w:pPr>
+        <w:pStyle w:val="ListParagraph"/>
+        <w:numPr>
+          <w:ilvl w:val="0"/>
+          <w:numId w:val="6"/>
+        </w:numPr>
         <w:spacing w:after="90" w:line="320"/>
-        <w:ind w:left="400" w:hanging="400"/>
-      </w:pPr>
-      <w:r>
-        <w:rPr>
-          <w:rFonts w:ascii="Calibri" w:cs="Calibri" w:eastAsia="Calibri" w:hAnsi="Calibri"/>
-          <w:b/>
-          <w:bCs/>
-          <w:color w:val="2D35C9"/>
-          <w:sz w:val="21"/>
-          <w:szCs w:val="21"/>
-        </w:rPr>
-        <w:t xml:space="preserve">9.  </w:t>
-      </w:r>
+      </w:pPr>
       <w:r>
         <w:rPr>
           <w:rFonts w:ascii="Calibri" w:cs="Calibri" w:eastAsia="Calibri" w:hAnsi="Calibri"/>
@@ -2329,20 +2198,13 @@
     </w:p>
     <w:p>
       <w:pPr>
-        <w:spacing w:after="90" w:line="320"/>
-        <w:ind w:left="400" w:hanging="400"/>
-      </w:pPr>
-      <w:r>
-        <w:rPr>
-          <w:rFonts w:ascii="Calibri" w:cs="Calibri" w:eastAsia="Calibri" w:hAnsi="Calibri"/>
-          <w:b/>
-          <w:bCs/>
-          <w:color w:val="2D35C9"/>
-          <w:sz w:val="21"/>
-          <w:szCs w:val="21"/>
-        </w:rPr>
-        <w:t xml:space="preserve">10.  </w:t>
-      </w:r>
+        <w:pStyle w:val="ListParagraph"/>
+        <w:numPr>
+          <w:ilvl w:val="0"/>
+          <w:numId w:val="6"/>
+        </w:numPr>
+        <w:spacing w:after="140" w:line="320"/>
+      </w:pPr>
       <w:r>
         <w:rPr>
           <w:rFonts w:ascii="Calibri" w:cs="Calibri" w:eastAsia="Calibri" w:hAnsi="Calibri"/>
@@ -2425,20 +2287,13 @@
     </w:p>
     <w:p>
       <w:pPr>
+        <w:pStyle w:val="ListParagraph"/>
+        <w:numPr>
+          <w:ilvl w:val="0"/>
+          <w:numId w:val="7"/>
+        </w:numPr>
         <w:spacing w:after="90" w:line="320"/>
-        <w:ind w:left="400" w:hanging="400"/>
-      </w:pPr>
-      <w:r>
-        <w:rPr>
-          <w:rFonts w:ascii="Calibri" w:cs="Calibri" w:eastAsia="Calibri" w:hAnsi="Calibri"/>
-          <w:b/>
-          <w:bCs/>
-          <w:color w:val="2D35C9"/>
-          <w:sz w:val="21"/>
-          <w:szCs w:val="21"/>
-        </w:rPr>
-        <w:t xml:space="preserve">1.  </w:t>
-      </w:r>
+      </w:pPr>
       <w:r>
         <w:rPr>
           <w:rFonts w:ascii="Calibri" w:cs="Calibri" w:eastAsia="Calibri" w:hAnsi="Calibri"/>
@@ -2453,20 +2308,13 @@
     </w:p>
     <w:p>
       <w:pPr>
+        <w:pStyle w:val="ListParagraph"/>
+        <w:numPr>
+          <w:ilvl w:val="0"/>
+          <w:numId w:val="7"/>
+        </w:numPr>
         <w:spacing w:after="90" w:line="320"/>
-        <w:ind w:left="400" w:hanging="400"/>
-      </w:pPr>
-      <w:r>
-        <w:rPr>
-          <w:rFonts w:ascii="Calibri" w:cs="Calibri" w:eastAsia="Calibri" w:hAnsi="Calibri"/>
-          <w:b/>
-          <w:bCs/>
-          <w:color w:val="2D35C9"/>
-          <w:sz w:val="21"/>
-          <w:szCs w:val="21"/>
-        </w:rPr>
-        <w:t xml:space="preserve">2.  </w:t>
-      </w:r>
+      </w:pPr>
       <w:r>
         <w:rPr>
           <w:rFonts w:ascii="Calibri" w:cs="Calibri" w:eastAsia="Calibri" w:hAnsi="Calibri"/>
@@ -2490,20 +2338,13 @@
     </w:p>
     <w:p>
       <w:pPr>
+        <w:pStyle w:val="ListParagraph"/>
+        <w:numPr>
+          <w:ilvl w:val="0"/>
+          <w:numId w:val="7"/>
+        </w:numPr>
         <w:spacing w:after="90" w:line="320"/>
-        <w:ind w:left="400" w:hanging="400"/>
-      </w:pPr>
-      <w:r>
-        <w:rPr>
-          <w:rFonts w:ascii="Calibri" w:cs="Calibri" w:eastAsia="Calibri" w:hAnsi="Calibri"/>
-          <w:b/>
-          <w:bCs/>
-          <w:color w:val="2D35C9"/>
-          <w:sz w:val="21"/>
-          <w:szCs w:val="21"/>
-        </w:rPr>
-        <w:t xml:space="preserve">3.  </w:t>
-      </w:r>
+      </w:pPr>
       <w:r>
         <w:rPr>
           <w:rFonts w:ascii="Calibri" w:cs="Calibri" w:eastAsia="Calibri" w:hAnsi="Calibri"/>
@@ -2518,20 +2359,13 @@
     </w:p>
     <w:p>
       <w:pPr>
+        <w:pStyle w:val="ListParagraph"/>
+        <w:numPr>
+          <w:ilvl w:val="0"/>
+          <w:numId w:val="7"/>
+        </w:numPr>
         <w:spacing w:after="90" w:line="320"/>
-        <w:ind w:left="400" w:hanging="400"/>
-      </w:pPr>
-      <w:r>
-        <w:rPr>
-          <w:rFonts w:ascii="Calibri" w:cs="Calibri" w:eastAsia="Calibri" w:hAnsi="Calibri"/>
-          <w:b/>
-          <w:bCs/>
-          <w:color w:val="2D35C9"/>
-          <w:sz w:val="21"/>
-          <w:szCs w:val="21"/>
-        </w:rPr>
-        <w:t xml:space="preserve">4.  </w:t>
-      </w:r>
+      </w:pPr>
       <w:r>
         <w:rPr>
           <w:rFonts w:ascii="Calibri" w:cs="Calibri" w:eastAsia="Calibri" w:hAnsi="Calibri"/>
@@ -2555,20 +2389,13 @@
     </w:p>
     <w:p>
       <w:pPr>
-        <w:spacing w:after="90" w:line="320"/>
-        <w:ind w:left="400" w:hanging="400"/>
-      </w:pPr>
-      <w:r>
-        <w:rPr>
-          <w:rFonts w:ascii="Calibri" w:cs="Calibri" w:eastAsia="Calibri" w:hAnsi="Calibri"/>
-          <w:b/>
-          <w:bCs/>
-          <w:color w:val="2D35C9"/>
-          <w:sz w:val="21"/>
-          <w:szCs w:val="21"/>
-        </w:rPr>
-        <w:t xml:space="preserve">5.  </w:t>
-      </w:r>
+        <w:pStyle w:val="ListParagraph"/>
+        <w:numPr>
+          <w:ilvl w:val="0"/>
+          <w:numId w:val="7"/>
+        </w:numPr>
+        <w:spacing w:after="140" w:line="320"/>
+      </w:pPr>
       <w:r>
         <w:rPr>
           <w:rFonts w:ascii="Calibri" w:cs="Calibri" w:eastAsia="Calibri" w:hAnsi="Calibri"/>
@@ -3165,7 +2992,7 @@
           <w:ilvl w:val="0"/>
           <w:numId w:val="2"/>
         </w:numPr>
-        <w:spacing w:after="90" w:line="320"/>
+        <w:spacing w:after="140" w:line="320"/>
       </w:pPr>
       <w:r>
         <w:rPr>
@@ -3224,20 +3051,13 @@
     </w:p>
     <w:p>
       <w:pPr>
+        <w:pStyle w:val="ListParagraph"/>
+        <w:numPr>
+          <w:ilvl w:val="0"/>
+          <w:numId w:val="8"/>
+        </w:numPr>
         <w:spacing w:after="90" w:line="320"/>
-        <w:ind w:left="400" w:hanging="400"/>
-      </w:pPr>
-      <w:r>
-        <w:rPr>
-          <w:rFonts w:ascii="Calibri" w:cs="Calibri" w:eastAsia="Calibri" w:hAnsi="Calibri"/>
-          <w:b/>
-          <w:bCs/>
-          <w:color w:val="2D35C9"/>
-          <w:sz w:val="21"/>
-          <w:szCs w:val="21"/>
-        </w:rPr>
-        <w:t xml:space="preserve">1.  </w:t>
-      </w:r>
+      </w:pPr>
       <w:r>
         <w:rPr>
           <w:rFonts w:ascii="Calibri" w:cs="Calibri" w:eastAsia="Calibri" w:hAnsi="Calibri"/>
@@ -3250,20 +3070,13 @@
     </w:p>
     <w:p>
       <w:pPr>
+        <w:pStyle w:val="ListParagraph"/>
+        <w:numPr>
+          <w:ilvl w:val="0"/>
+          <w:numId w:val="8"/>
+        </w:numPr>
         <w:spacing w:after="90" w:line="320"/>
-        <w:ind w:left="400" w:hanging="400"/>
-      </w:pPr>
-      <w:r>
-        <w:rPr>
-          <w:rFonts w:ascii="Calibri" w:cs="Calibri" w:eastAsia="Calibri" w:hAnsi="Calibri"/>
-          <w:b/>
-          <w:bCs/>
-          <w:color w:val="2D35C9"/>
-          <w:sz w:val="21"/>
-          <w:szCs w:val="21"/>
-        </w:rPr>
-        <w:t xml:space="preserve">2.  </w:t>
-      </w:r>
+      </w:pPr>
       <w:r>
         <w:rPr>
           <w:rFonts w:ascii="Calibri" w:cs="Calibri" w:eastAsia="Calibri" w:hAnsi="Calibri"/>
@@ -3276,20 +3089,13 @@
     </w:p>
     <w:p>
       <w:pPr>
+        <w:pStyle w:val="ListParagraph"/>
+        <w:numPr>
+          <w:ilvl w:val="0"/>
+          <w:numId w:val="8"/>
+        </w:numPr>
         <w:spacing w:after="90" w:line="320"/>
-        <w:ind w:left="400" w:hanging="400"/>
-      </w:pPr>
-      <w:r>
-        <w:rPr>
-          <w:rFonts w:ascii="Calibri" w:cs="Calibri" w:eastAsia="Calibri" w:hAnsi="Calibri"/>
-          <w:b/>
-          <w:bCs/>
-          <w:color w:val="2D35C9"/>
-          <w:sz w:val="21"/>
-          <w:szCs w:val="21"/>
-        </w:rPr>
-        <w:t xml:space="preserve">3.  </w:t>
-      </w:r>
+      </w:pPr>
       <w:r>
         <w:rPr>
           <w:rFonts w:ascii="Calibri" w:cs="Calibri" w:eastAsia="Calibri" w:hAnsi="Calibri"/>
@@ -3302,20 +3108,13 @@
     </w:p>
     <w:p>
       <w:pPr>
-        <w:spacing w:after="90" w:line="320"/>
-        <w:ind w:left="400" w:hanging="400"/>
-      </w:pPr>
-      <w:r>
-        <w:rPr>
-          <w:rFonts w:ascii="Calibri" w:cs="Calibri" w:eastAsia="Calibri" w:hAnsi="Calibri"/>
-          <w:b/>
-          <w:bCs/>
-          <w:color w:val="2D35C9"/>
-          <w:sz w:val="21"/>
-          <w:szCs w:val="21"/>
-        </w:rPr>
-        <w:t xml:space="preserve">4.  </w:t>
-      </w:r>
+        <w:pStyle w:val="ListParagraph"/>
+        <w:numPr>
+          <w:ilvl w:val="0"/>
+          <w:numId w:val="8"/>
+        </w:numPr>
+        <w:spacing w:after="140" w:line="320"/>
+      </w:pPr>
       <w:r>
         <w:rPr>
           <w:rFonts w:ascii="Calibri" w:cs="Calibri" w:eastAsia="Calibri" w:hAnsi="Calibri"/>
@@ -3387,16 +3186,16 @@
     </w:p>
     <w:p>
       <w:pPr>
-        <w:spacing w:after="140" w:line="320"/>
-      </w:pPr>
-      <w:r>
-        <w:rPr>
-          <w:rFonts w:ascii="Calibri" w:cs="Calibri" w:eastAsia="Calibri" w:hAnsi="Calibri"/>
-          <w:color w:val="1A1510"/>
-          <w:sz w:val="21"/>
-          <w:szCs w:val="21"/>
-        </w:rPr>
-        <w:t xml:space="preserve">The table below records [ORGANISATION]'s own policy versions. The template's version and the date it was last checked against UK law and ICO guidance are in the footer of every page. They are not the same number, and a template update does not renumber your policy.</w:t>
+        <w:spacing w:after="360" w:line="320"/>
+      </w:pPr>
+      <w:r>
+        <w:rPr>
+          <w:rFonts w:ascii="Calibri" w:cs="Calibri" w:eastAsia="Calibri" w:hAnsi="Calibri"/>
+          <w:color w:val="1A1510"/>
+          <w:sz w:val="21"/>
+          <w:szCs w:val="21"/>
+        </w:rPr>
+        <w:t>The table below records [ORGANISATION]'s own policy versions. The date this template was last checked against UK law and ICO guidance is in the footer of every page. Adopting a newer template does not renumber your policy.</w:t>
       </w:r>
     </w:p>
     <w:tbl>
@@ -3642,13 +3441,16 @@
     </w:tbl>
     <w:p>
       <w:pPr>
-        <w:spacing w:after="200"/>
-      </w:pPr>
-    </w:p>
-    <w:p>
-      <w:pPr>
-        <w:spacing w:after="0" w:before="360"/>
-      </w:pPr>
+        <w:spacing w:before="180" w:after="180"/>
+        <w:rPr>
+          <w:sz w:val="2"/>
+        </w:rPr>
+      </w:pPr>
+      <w:r>
+        <w:rPr>
+          <w:sz w:val="2"/>
+        </w:rPr>
+      </w:r>
     </w:p>
     <w:tbl>
       <w:tblPr>
@@ -3742,10 +3544,8 @@
     </w:tbl>
     <w:p>
       <w:pPr>
-        <w:spacing w:after="200"/>
-      </w:pPr>
-    </w:p>
-    <w:p>
+        <w:spacing w:before="360"/>
+      </w:pPr>
       <w:r>
         <w:br w:type="page"/>
       </w:r>
@@ -3828,7 +3628,7 @@
     </w:p>
     <w:p>
       <w:pPr>
-        <w:spacing w:after="140" w:line="320"/>
+        <w:spacing w:after="360" w:line="320"/>
       </w:pPr>
       <w:r>
         <w:rPr>
@@ -4536,12 +4336,7 @@
     </w:tbl>
     <w:p>
       <w:pPr>
-        <w:spacing w:after="200"/>
-      </w:pPr>
-    </w:p>
-    <w:p>
-      <w:pPr>
-        <w:spacing w:after="140" w:line="320"/>
+        <w:spacing w:after="140" w:line="320" w:before="360"/>
       </w:pPr>
       <w:r>
         <w:rPr>
@@ -4661,20 +4456,13 @@
     </w:p>
     <w:p>
       <w:pPr>
+        <w:pStyle w:val="ListParagraph"/>
+        <w:numPr>
+          <w:ilvl w:val="0"/>
+          <w:numId w:val="9"/>
+        </w:numPr>
         <w:spacing w:after="90" w:line="320"/>
-        <w:ind w:left="400" w:hanging="400"/>
-      </w:pPr>
-      <w:r>
-        <w:rPr>
-          <w:rFonts w:ascii="Calibri" w:cs="Calibri" w:eastAsia="Calibri" w:hAnsi="Calibri"/>
-          <w:b/>
-          <w:bCs/>
-          <w:color w:val="2D35C9"/>
-          <w:sz w:val="21"/>
-          <w:szCs w:val="21"/>
-        </w:rPr>
-        <w:t xml:space="preserve">1.  </w:t>
-      </w:r>
+      </w:pPr>
       <w:r>
         <w:rPr>
           <w:rFonts w:ascii="Calibri" w:cs="Calibri" w:eastAsia="Calibri" w:hAnsi="Calibri"/>
@@ -4687,20 +4475,13 @@
     </w:p>
     <w:p>
       <w:pPr>
+        <w:pStyle w:val="ListParagraph"/>
+        <w:numPr>
+          <w:ilvl w:val="0"/>
+          <w:numId w:val="9"/>
+        </w:numPr>
         <w:spacing w:after="90" w:line="320"/>
-        <w:ind w:left="400" w:hanging="400"/>
-      </w:pPr>
-      <w:r>
-        <w:rPr>
-          <w:rFonts w:ascii="Calibri" w:cs="Calibri" w:eastAsia="Calibri" w:hAnsi="Calibri"/>
-          <w:b/>
-          <w:bCs/>
-          <w:color w:val="2D35C9"/>
-          <w:sz w:val="21"/>
-          <w:szCs w:val="21"/>
-        </w:rPr>
-        <w:t xml:space="preserve">2.  </w:t>
-      </w:r>
+      </w:pPr>
       <w:r>
         <w:rPr>
           <w:rFonts w:ascii="Calibri" w:cs="Calibri" w:eastAsia="Calibri" w:hAnsi="Calibri"/>
@@ -4713,20 +4494,13 @@
     </w:p>
     <w:p>
       <w:pPr>
-        <w:spacing w:after="90" w:line="320"/>
-        <w:ind w:left="400" w:hanging="400"/>
-      </w:pPr>
-      <w:r>
-        <w:rPr>
-          <w:rFonts w:ascii="Calibri" w:cs="Calibri" w:eastAsia="Calibri" w:hAnsi="Calibri"/>
-          <w:b/>
-          <w:bCs/>
-          <w:color w:val="2D35C9"/>
-          <w:sz w:val="21"/>
-          <w:szCs w:val="21"/>
-        </w:rPr>
-        <w:t xml:space="preserve">3.  </w:t>
-      </w:r>
+        <w:pStyle w:val="ListParagraph"/>
+        <w:numPr>
+          <w:ilvl w:val="0"/>
+          <w:numId w:val="9"/>
+        </w:numPr>
+        <w:spacing w:after="140" w:line="320"/>
+      </w:pPr>
       <w:r>
         <w:rPr>
           <w:rFonts w:ascii="Calibri" w:cs="Calibri" w:eastAsia="Calibri" w:hAnsi="Calibri"/>
@@ -4853,7 +4627,7 @@
         <w:sz w:val="16"/>
         <w:szCs w:val="16"/>
       </w:rPr>
-      <w:t xml:space="preserve">AI Use Policy template v1.0  ·  Jasmin Aziz  ·  theeditai.co.uk/policy-template  ·  Last checked 25 Aug 2026        </w:t>
+      <w:t xml:space="preserve">AI Use Policy template  ·  Jasmin Aziz  ·  theeditai.co.uk/policy-template  ·  Last checked 25 Aug 2026        </w:t>
     </w:r>
     <w:r>
       <w:rPr>
@@ -4910,90 +4684,6 @@
 
 <file path=word/numbering.xml><?xml version="1.0" encoding="utf-8"?>
 <w:numbering xmlns:wpc="http://schemas.microsoft.com/office/word/2010/wordprocessingCanvas" xmlns:mc="http://schemas.openxmlformats.org/markup-compatibility/2006" xmlns:o="urn:schemas-microsoft-com:office:office" xmlns:r="http://schemas.openxmlformats.org/officeDocument/2006/relationships" xmlns:m="http://schemas.openxmlformats.org/officeDocument/2006/math" xmlns:v="urn:schemas-microsoft-com:vml" xmlns:wp14="http://schemas.microsoft.com/office/word/2010/wordprocessingDrawing" xmlns:wp="http://schemas.openxmlformats.org/drawingml/2006/wordprocessingDrawing" xmlns:w10="urn:schemas-microsoft-com:office:word" xmlns:w="http://schemas.openxmlformats.org/wordprocessingml/2006/main" xmlns:w14="http://schemas.microsoft.com/office/word/2010/wordml" xmlns:w15="http://schemas.microsoft.com/office/word/2012/wordml" xmlns:wpg="http://schemas.microsoft.com/office/word/2010/wordprocessingGroup" xmlns:wpi="http://schemas.microsoft.com/office/word/2010/wordprocessingInk" xmlns:wne="http://schemas.microsoft.com/office/word/2006/wordml" xmlns:wps="http://schemas.microsoft.com/office/word/2010/wordprocessingShape" mc:Ignorable="w14 w15 wp14">
-  <w:abstractNum w:abstractNumId="1" w15:restartNumberingAfterBreak="0">
-    <w:multiLevelType w:val="hybridMultilevel"/>
-    <w:lvl w:ilvl="0" w15:tentative="1">
-      <w:start w:val="1"/>
-      <w:numFmt w:val="bullet"/>
-      <w:lvlText w:val="●"/>
-      <w:lvlJc w:val="left"/>
-      <w:pPr>
-        <w:ind w:left="720" w:hanging="360"/>
-      </w:pPr>
-    </w:lvl>
-    <w:lvl w:ilvl="1" w15:tentative="1">
-      <w:start w:val="1"/>
-      <w:numFmt w:val="bullet"/>
-      <w:lvlText w:val="○"/>
-      <w:lvlJc w:val="left"/>
-      <w:pPr>
-        <w:ind w:left="1440" w:hanging="360"/>
-      </w:pPr>
-    </w:lvl>
-    <w:lvl w:ilvl="2" w15:tentative="1">
-      <w:start w:val="1"/>
-      <w:numFmt w:val="bullet"/>
-      <w:lvlText w:val="■"/>
-      <w:lvlJc w:val="left"/>
-      <w:pPr>
-        <w:ind w:left="2160" w:hanging="360"/>
-      </w:pPr>
-    </w:lvl>
-    <w:lvl w:ilvl="3" w15:tentative="1">
-      <w:start w:val="1"/>
-      <w:numFmt w:val="bullet"/>
-      <w:lvlText w:val="●"/>
-      <w:lvlJc w:val="left"/>
-      <w:pPr>
-        <w:ind w:left="2880" w:hanging="360"/>
-      </w:pPr>
-    </w:lvl>
-    <w:lvl w:ilvl="4" w15:tentative="1">
-      <w:start w:val="1"/>
-      <w:numFmt w:val="bullet"/>
-      <w:lvlText w:val="○"/>
-      <w:lvlJc w:val="left"/>
-      <w:pPr>
-        <w:ind w:left="3600" w:hanging="360"/>
-      </w:pPr>
-    </w:lvl>
-    <w:lvl w:ilvl="5" w15:tentative="1">
-      <w:start w:val="1"/>
-      <w:numFmt w:val="bullet"/>
-      <w:lvlText w:val="■"/>
-      <w:lvlJc w:val="left"/>
-      <w:pPr>
-        <w:ind w:left="4320" w:hanging="360"/>
-      </w:pPr>
-    </w:lvl>
-    <w:lvl w:ilvl="6" w15:tentative="1">
-      <w:start w:val="1"/>
-      <w:numFmt w:val="bullet"/>
-      <w:lvlText w:val="●"/>
-      <w:lvlJc w:val="left"/>
-      <w:pPr>
-        <w:ind w:left="5040" w:hanging="360"/>
-      </w:pPr>
-    </w:lvl>
-    <w:lvl w:ilvl="7" w15:tentative="1">
-      <w:start w:val="1"/>
-      <w:numFmt w:val="bullet"/>
-      <w:lvlText w:val="●"/>
-      <w:lvlJc w:val="left"/>
-      <w:pPr>
-        <w:ind w:left="5760" w:hanging="360"/>
-      </w:pPr>
-    </w:lvl>
-    <w:lvl w:ilvl="8" w15:tentative="1">
-      <w:start w:val="1"/>
-      <w:numFmt w:val="bullet"/>
-      <w:lvlText w:val="●"/>
-      <w:lvlJc w:val="left"/>
-      <w:pPr>
-        <w:ind w:left="6480" w:hanging="360"/>
-      </w:pPr>
-    </w:lvl>
-  </w:abstractNum>
   <w:abstractNum w:abstractNumId="2" w15:restartNumberingAfterBreak="0">
     <w:multiLevelType w:val="hybridMultilevel"/>
     <w:lvl w:ilvl="0" w15:tentative="1">
@@ -5009,14 +4699,62 @@
       </w:rPr>
     </w:lvl>
   </w:abstractNum>
-  <w:num w:numId="1">
-    <w:abstractNumId w:val="1"/>
+  <w:abstractNum w:abstractNumId="3">
+    <w:multiLevelType w:val="hybridMultilevel"/>
+    <w:lvl w:ilvl="0">
+      <w:start w:val="1"/>
+      <w:numFmt w:val="decimal"/>
+      <w:lvlText w:val="%1."/>
+      <w:lvlJc w:val="left"/>
+      <w:pPr>
+        <w:ind w:left="560" w:hanging="380"/>
+      </w:pPr>
+      <w:rPr>
+        <w:rFonts w:ascii="Plus Jakarta Sans" w:hAnsi="Plus Jakarta Sans" w:cs="Plus Jakarta Sans" w:eastAsia="Plus Jakarta Sans"/>
+        <w:b/>
+        <w:color w:val="2D35C9"/>
+        <w:sz w:val="21"/>
+      </w:rPr>
+    </w:lvl>
+  </w:abstractNum>
+  <w:num w:numId="2">
+    <w:abstractNumId w:val="2"/>
     <w:lvlOverride w:ilvl="0">
       <w:startOverride w:val="1"/>
     </w:lvlOverride>
   </w:num>
-  <w:num w:numId="2">
-    <w:abstractNumId w:val="2"/>
+  <w:num w:numId="4">
+    <w:abstractNumId w:val="3"/>
+    <w:lvlOverride w:ilvl="0">
+      <w:startOverride w:val="1"/>
+    </w:lvlOverride>
+  </w:num>
+  <w:num w:numId="5">
+    <w:abstractNumId w:val="3"/>
+    <w:lvlOverride w:ilvl="0">
+      <w:startOverride w:val="1"/>
+    </w:lvlOverride>
+  </w:num>
+  <w:num w:numId="6">
+    <w:abstractNumId w:val="3"/>
+    <w:lvlOverride w:ilvl="0">
+      <w:startOverride w:val="1"/>
+    </w:lvlOverride>
+  </w:num>
+  <w:num w:numId="7">
+    <w:abstractNumId w:val="3"/>
+    <w:lvlOverride w:ilvl="0">
+      <w:startOverride w:val="1"/>
+    </w:lvlOverride>
+  </w:num>
+  <w:num w:numId="8">
+    <w:abstractNumId w:val="3"/>
+    <w:lvlOverride w:ilvl="0">
+      <w:startOverride w:val="1"/>
+    </w:lvlOverride>
+  </w:num>
+  <w:num w:numId="9">
+    <w:abstractNumId w:val="3"/>
     <w:lvlOverride w:ilvl="0">
       <w:startOverride w:val="1"/>
     </w:lvlOverride>

</xml_diff>